<commit_message>
Documentacao final: prints do pipeline, integrante e checklist concluido
- 11 prints da execucao #3 (build, testes, imagem, deploys, aprovacao,
  ambientes de staging e producao, Swagger e deployments)
- README com integrante, novas evidencias e checklist marcado
- PDF regenerado com os prints e o desafio da aprovacao de producao
</commit_message>
<xml_diff>
--- a/docs/GaiaOps-ESG-DevOps.docx
+++ b/docs/GaiaOps-ESG-DevOps.docx
@@ -124,7 +124,7 @@
               <w:rPr>
                 <w:sz w:val="19"/>
               </w:rPr>
-              <w:t>Nome do integrante</w:t>
+              <w:t>João Victor Semente Dias</w:t>
             </w:r>
           </w:p>
         </w:tc>
@@ -142,7 +142,7 @@
               <w:rPr>
                 <w:sz w:val="19"/>
               </w:rPr>
-              <w:t>RM00000</w:t>
+              <w:t>RM562065</w:t>
             </w:r>
           </w:p>
         </w:tc>
@@ -172,7 +172,7 @@
         <w:jc w:val="center"/>
       </w:pPr>
       <w:r>
-        <w:t>30/09/2026</w:t>
+        <w:t>13/10/2026</w:t>
       </w:r>
     </w:p>
     <w:p>
@@ -6481,27 +6481,41 @@
     </w:p>
     <w:p>
       <w:pPr>
-        <w:shd w:val="clear" w:color="auto" w:fill="FFF4E5"/>
-        <w:pBdr>
-          <w:top w:val="single" w:sz="12" w:space="6" w:color="E67E22"/>
-          <w:bottom w:val="single" w:sz="12" w:space="6" w:color="E67E22"/>
-          <w:left w:val="single" w:sz="12" w:space="6" w:color="E67E22"/>
-          <w:right w:val="single" w:sz="12" w:space="6" w:color="E67E22"/>
-        </w:pBdr>
+        <w:jc w:val="center"/>
       </w:pPr>
       <w:r>
-        <w:rPr>
-          <w:b/>
-          <w:color w:val="B35C00"/>
-        </w:rPr>
-        <w:t>PRINT PENDENTE: docs/prints/01-pipeline-visao-geral.png</w:t>
-        <w:br/>
-      </w:r>
-      <w:r>
-        <w:rPr>
-          <w:sz w:val="20"/>
-        </w:rPr>
-        <w:t>Actions &gt; execução CI/CD: o grafo com Build, Testes, Imagem Docker, Deploy staging e Deploy producao, todos verdes.</w:t>
+        <w:drawing>
+          <wp:inline xmlns:a="http://schemas.openxmlformats.org/drawingml/2006/main" xmlns:pic="http://schemas.openxmlformats.org/drawingml/2006/picture">
+            <wp:extent cx="5940000" cy="2927773"/>
+            <wp:docPr id="1" name="Picture 1"/>
+            <wp:cNvGraphicFramePr>
+              <a:graphicFrameLocks noChangeAspect="1"/>
+            </wp:cNvGraphicFramePr>
+            <a:graphic>
+              <a:graphicData uri="http://schemas.openxmlformats.org/drawingml/2006/picture">
+                <pic:pic>
+                  <pic:nvPicPr>
+                    <pic:cNvPr id="0" name="01-pipeline-visao-geral.png"/>
+                    <pic:cNvPicPr/>
+                  </pic:nvPicPr>
+                  <pic:blipFill>
+                    <a:blip r:embed="rId10"/>
+                    <a:stretch>
+                      <a:fillRect/>
+                    </a:stretch>
+                  </pic:blipFill>
+                  <pic:spPr>
+                    <a:xfrm>
+                      <a:off x="0" y="0"/>
+                      <a:ext cx="5940000" cy="2927773"/>
+                    </a:xfrm>
+                    <a:prstGeom prst="rect"/>
+                  </pic:spPr>
+                </pic:pic>
+              </a:graphicData>
+            </a:graphic>
+          </wp:inline>
+        </w:drawing>
       </w:r>
     </w:p>
     <w:p>
@@ -6518,27 +6532,41 @@
     </w:p>
     <w:p>
       <w:pPr>
-        <w:shd w:val="clear" w:color="auto" w:fill="FFF4E5"/>
-        <w:pBdr>
-          <w:top w:val="single" w:sz="12" w:space="6" w:color="E67E22"/>
-          <w:bottom w:val="single" w:sz="12" w:space="6" w:color="E67E22"/>
-          <w:left w:val="single" w:sz="12" w:space="6" w:color="E67E22"/>
-          <w:right w:val="single" w:sz="12" w:space="6" w:color="E67E22"/>
-        </w:pBdr>
+        <w:jc w:val="center"/>
       </w:pPr>
       <w:r>
-        <w:rPr>
-          <w:b/>
-          <w:color w:val="B35C00"/>
-        </w:rPr>
-        <w:t>PRINT PENDENTE: docs/prints/02-build.png</w:t>
-        <w:br/>
-      </w:r>
-      <w:r>
-        <w:rPr>
-          <w:sz w:val="20"/>
-        </w:rPr>
-        <w:t>Job '1. Build' com o passo 'Compilar e empacotar' expandido mostrando BUILD SUCCESS.</w:t>
+        <w:drawing>
+          <wp:inline xmlns:a="http://schemas.openxmlformats.org/drawingml/2006/main" xmlns:pic="http://schemas.openxmlformats.org/drawingml/2006/picture">
+            <wp:extent cx="5940000" cy="2944963"/>
+            <wp:docPr id="2" name="Picture 2"/>
+            <wp:cNvGraphicFramePr>
+              <a:graphicFrameLocks noChangeAspect="1"/>
+            </wp:cNvGraphicFramePr>
+            <a:graphic>
+              <a:graphicData uri="http://schemas.openxmlformats.org/drawingml/2006/picture">
+                <pic:pic>
+                  <pic:nvPicPr>
+                    <pic:cNvPr id="0" name="02-build.png"/>
+                    <pic:cNvPicPr/>
+                  </pic:nvPicPr>
+                  <pic:blipFill>
+                    <a:blip r:embed="rId11"/>
+                    <a:stretch>
+                      <a:fillRect/>
+                    </a:stretch>
+                  </pic:blipFill>
+                  <pic:spPr>
+                    <a:xfrm>
+                      <a:off x="0" y="0"/>
+                      <a:ext cx="5940000" cy="2944963"/>
+                    </a:xfrm>
+                    <a:prstGeom prst="rect"/>
+                  </pic:spPr>
+                </pic:pic>
+              </a:graphicData>
+            </a:graphic>
+          </wp:inline>
+        </w:drawing>
       </w:r>
     </w:p>
     <w:p>
@@ -6555,27 +6583,41 @@
     </w:p>
     <w:p>
       <w:pPr>
-        <w:shd w:val="clear" w:color="auto" w:fill="FFF4E5"/>
-        <w:pBdr>
-          <w:top w:val="single" w:sz="12" w:space="6" w:color="E67E22"/>
-          <w:bottom w:val="single" w:sz="12" w:space="6" w:color="E67E22"/>
-          <w:left w:val="single" w:sz="12" w:space="6" w:color="E67E22"/>
-          <w:right w:val="single" w:sz="12" w:space="6" w:color="E67E22"/>
-        </w:pBdr>
+        <w:jc w:val="center"/>
       </w:pPr>
       <w:r>
-        <w:rPr>
-          <w:b/>
-          <w:color w:val="B35C00"/>
-        </w:rPr>
-        <w:t>PRINT PENDENTE: docs/prints/03-testes.png</w:t>
-        <w:br/>
-      </w:r>
-      <w:r>
-        <w:rPr>
-          <w:sz w:val="20"/>
-        </w:rPr>
-        <w:t>Summary da execução: tabela 'Testes automatizados' com unitários, integração e cobertura.</w:t>
+        <w:drawing>
+          <wp:inline xmlns:a="http://schemas.openxmlformats.org/drawingml/2006/main" xmlns:pic="http://schemas.openxmlformats.org/drawingml/2006/picture">
+            <wp:extent cx="5940000" cy="1416811"/>
+            <wp:docPr id="3" name="Picture 3"/>
+            <wp:cNvGraphicFramePr>
+              <a:graphicFrameLocks noChangeAspect="1"/>
+            </wp:cNvGraphicFramePr>
+            <a:graphic>
+              <a:graphicData uri="http://schemas.openxmlformats.org/drawingml/2006/picture">
+                <pic:pic>
+                  <pic:nvPicPr>
+                    <pic:cNvPr id="0" name="03-testes.png"/>
+                    <pic:cNvPicPr/>
+                  </pic:nvPicPr>
+                  <pic:blipFill>
+                    <a:blip r:embed="rId12"/>
+                    <a:stretch>
+                      <a:fillRect/>
+                    </a:stretch>
+                  </pic:blipFill>
+                  <pic:spPr>
+                    <a:xfrm>
+                      <a:off x="0" y="0"/>
+                      <a:ext cx="5940000" cy="1416811"/>
+                    </a:xfrm>
+                    <a:prstGeom prst="rect"/>
+                  </pic:spPr>
+                </pic:pic>
+              </a:graphicData>
+            </a:graphic>
+          </wp:inline>
+        </w:drawing>
       </w:r>
     </w:p>
     <w:p>
@@ -6592,27 +6634,41 @@
     </w:p>
     <w:p>
       <w:pPr>
-        <w:shd w:val="clear" w:color="auto" w:fill="FFF4E5"/>
-        <w:pBdr>
-          <w:top w:val="single" w:sz="12" w:space="6" w:color="E67E22"/>
-          <w:bottom w:val="single" w:sz="12" w:space="6" w:color="E67E22"/>
-          <w:left w:val="single" w:sz="12" w:space="6" w:color="E67E22"/>
-          <w:right w:val="single" w:sz="12" w:space="6" w:color="E67E22"/>
-        </w:pBdr>
+        <w:jc w:val="center"/>
       </w:pPr>
       <w:r>
-        <w:rPr>
-          <w:b/>
-          <w:color w:val="B35C00"/>
-        </w:rPr>
-        <w:t>PRINT PENDENTE: docs/prints/04-imagem-ghcr.png</w:t>
-        <w:br/>
-      </w:r>
-      <w:r>
-        <w:rPr>
-          <w:sz w:val="20"/>
-        </w:rPr>
-        <w:t>Packages &gt; gaiaops-esg: tags do commit, latest, staging e production.</w:t>
+        <w:drawing>
+          <wp:inline xmlns:a="http://schemas.openxmlformats.org/drawingml/2006/main" xmlns:pic="http://schemas.openxmlformats.org/drawingml/2006/picture">
+            <wp:extent cx="5940000" cy="4527001"/>
+            <wp:docPr id="4" name="Picture 4"/>
+            <wp:cNvGraphicFramePr>
+              <a:graphicFrameLocks noChangeAspect="1"/>
+            </wp:cNvGraphicFramePr>
+            <a:graphic>
+              <a:graphicData uri="http://schemas.openxmlformats.org/drawingml/2006/picture">
+                <pic:pic>
+                  <pic:nvPicPr>
+                    <pic:cNvPr id="0" name="04-imagem-ghcr.png"/>
+                    <pic:cNvPicPr/>
+                  </pic:nvPicPr>
+                  <pic:blipFill>
+                    <a:blip r:embed="rId13"/>
+                    <a:stretch>
+                      <a:fillRect/>
+                    </a:stretch>
+                  </pic:blipFill>
+                  <pic:spPr>
+                    <a:xfrm>
+                      <a:off x="0" y="0"/>
+                      <a:ext cx="5940000" cy="4527001"/>
+                    </a:xfrm>
+                    <a:prstGeom prst="rect"/>
+                  </pic:spPr>
+                </pic:pic>
+              </a:graphicData>
+            </a:graphic>
+          </wp:inline>
+        </w:drawing>
       </w:r>
     </w:p>
     <w:p>
@@ -6629,27 +6685,41 @@
     </w:p>
     <w:p>
       <w:pPr>
-        <w:shd w:val="clear" w:color="auto" w:fill="FFF4E5"/>
-        <w:pBdr>
-          <w:top w:val="single" w:sz="12" w:space="6" w:color="E67E22"/>
-          <w:bottom w:val="single" w:sz="12" w:space="6" w:color="E67E22"/>
-          <w:left w:val="single" w:sz="12" w:space="6" w:color="E67E22"/>
-          <w:right w:val="single" w:sz="12" w:space="6" w:color="E67E22"/>
-        </w:pBdr>
+        <w:jc w:val="center"/>
       </w:pPr>
       <w:r>
-        <w:rPr>
-          <w:b/>
-          <w:color w:val="B35C00"/>
-        </w:rPr>
-        <w:t>PRINT PENDENTE: docs/prints/05-deploy-staging.png</w:t>
-        <w:br/>
-      </w:r>
-      <w:r>
-        <w:rPr>
-          <w:sz w:val="20"/>
-        </w:rPr>
-        <w:t>Job '4. Deploy staging', passo 'Smoke test' expandido: 8/8 verificacoes OK.</w:t>
+        <w:drawing>
+          <wp:inline xmlns:a="http://schemas.openxmlformats.org/drawingml/2006/main" xmlns:pic="http://schemas.openxmlformats.org/drawingml/2006/picture">
+            <wp:extent cx="5940000" cy="2976266"/>
+            <wp:docPr id="5" name="Picture 5"/>
+            <wp:cNvGraphicFramePr>
+              <a:graphicFrameLocks noChangeAspect="1"/>
+            </wp:cNvGraphicFramePr>
+            <a:graphic>
+              <a:graphicData uri="http://schemas.openxmlformats.org/drawingml/2006/picture">
+                <pic:pic>
+                  <pic:nvPicPr>
+                    <pic:cNvPr id="0" name="05-deploy-staging.png"/>
+                    <pic:cNvPicPr/>
+                  </pic:nvPicPr>
+                  <pic:blipFill>
+                    <a:blip r:embed="rId14"/>
+                    <a:stretch>
+                      <a:fillRect/>
+                    </a:stretch>
+                  </pic:blipFill>
+                  <pic:spPr>
+                    <a:xfrm>
+                      <a:off x="0" y="0"/>
+                      <a:ext cx="5940000" cy="2976266"/>
+                    </a:xfrm>
+                    <a:prstGeom prst="rect"/>
+                  </pic:spPr>
+                </pic:pic>
+              </a:graphicData>
+            </a:graphic>
+          </wp:inline>
+        </w:drawing>
       </w:r>
     </w:p>
     <w:p>
@@ -6666,27 +6736,41 @@
     </w:p>
     <w:p>
       <w:pPr>
-        <w:shd w:val="clear" w:color="auto" w:fill="FFF4E5"/>
-        <w:pBdr>
-          <w:top w:val="single" w:sz="12" w:space="6" w:color="E67E22"/>
-          <w:bottom w:val="single" w:sz="12" w:space="6" w:color="E67E22"/>
-          <w:left w:val="single" w:sz="12" w:space="6" w:color="E67E22"/>
-          <w:right w:val="single" w:sz="12" w:space="6" w:color="E67E22"/>
-        </w:pBdr>
+        <w:jc w:val="center"/>
       </w:pPr>
       <w:r>
-        <w:rPr>
-          <w:b/>
-          <w:color w:val="B35C00"/>
-        </w:rPr>
-        <w:t>PRINT PENDENTE: docs/prints/06-aprovacao-producao.png</w:t>
-        <w:br/>
-      </w:r>
-      <w:r>
-        <w:rPr>
-          <w:sz w:val="20"/>
-        </w:rPr>
-        <w:t>Execução aguardando revisão: aviso 'Waiting for review' / botão 'Review deployments'.</w:t>
+        <w:drawing>
+          <wp:inline xmlns:a="http://schemas.openxmlformats.org/drawingml/2006/main" xmlns:pic="http://schemas.openxmlformats.org/drawingml/2006/picture">
+            <wp:extent cx="5940000" cy="2943440"/>
+            <wp:docPr id="6" name="Picture 6"/>
+            <wp:cNvGraphicFramePr>
+              <a:graphicFrameLocks noChangeAspect="1"/>
+            </wp:cNvGraphicFramePr>
+            <a:graphic>
+              <a:graphicData uri="http://schemas.openxmlformats.org/drawingml/2006/picture">
+                <pic:pic>
+                  <pic:nvPicPr>
+                    <pic:cNvPr id="0" name="06-aprovacao-producao.png"/>
+                    <pic:cNvPicPr/>
+                  </pic:nvPicPr>
+                  <pic:blipFill>
+                    <a:blip r:embed="rId15"/>
+                    <a:stretch>
+                      <a:fillRect/>
+                    </a:stretch>
+                  </pic:blipFill>
+                  <pic:spPr>
+                    <a:xfrm>
+                      <a:off x="0" y="0"/>
+                      <a:ext cx="5940000" cy="2943440"/>
+                    </a:xfrm>
+                    <a:prstGeom prst="rect"/>
+                  </pic:spPr>
+                </pic:pic>
+              </a:graphicData>
+            </a:graphic>
+          </wp:inline>
+        </w:drawing>
       </w:r>
     </w:p>
     <w:p>
@@ -6703,27 +6787,41 @@
     </w:p>
     <w:p>
       <w:pPr>
-        <w:shd w:val="clear" w:color="auto" w:fill="FFF4E5"/>
-        <w:pBdr>
-          <w:top w:val="single" w:sz="12" w:space="6" w:color="E67E22"/>
-          <w:bottom w:val="single" w:sz="12" w:space="6" w:color="E67E22"/>
-          <w:left w:val="single" w:sz="12" w:space="6" w:color="E67E22"/>
-          <w:right w:val="single" w:sz="12" w:space="6" w:color="E67E22"/>
-        </w:pBdr>
+        <w:jc w:val="center"/>
       </w:pPr>
       <w:r>
-        <w:rPr>
-          <w:b/>
-          <w:color w:val="B35C00"/>
-        </w:rPr>
-        <w:t>PRINT PENDENTE: docs/prints/07-deploy-producao.png</w:t>
-        <w:br/>
-      </w:r>
-      <w:r>
-        <w:rPr>
-          <w:sz w:val="20"/>
-        </w:rPr>
-        <w:t>Job '5. Deploy producao', passo 'Smoke test' expandido: 8/8 verificacoes OK.</w:t>
+        <w:drawing>
+          <wp:inline xmlns:a="http://schemas.openxmlformats.org/drawingml/2006/main" xmlns:pic="http://schemas.openxmlformats.org/drawingml/2006/picture">
+            <wp:extent cx="5940000" cy="2959017"/>
+            <wp:docPr id="7" name="Picture 7"/>
+            <wp:cNvGraphicFramePr>
+              <a:graphicFrameLocks noChangeAspect="1"/>
+            </wp:cNvGraphicFramePr>
+            <a:graphic>
+              <a:graphicData uri="http://schemas.openxmlformats.org/drawingml/2006/picture">
+                <pic:pic>
+                  <pic:nvPicPr>
+                    <pic:cNvPr id="0" name="07-deploy-producao.png"/>
+                    <pic:cNvPicPr/>
+                  </pic:nvPicPr>
+                  <pic:blipFill>
+                    <a:blip r:embed="rId16"/>
+                    <a:stretch>
+                      <a:fillRect/>
+                    </a:stretch>
+                  </pic:blipFill>
+                  <pic:spPr>
+                    <a:xfrm>
+                      <a:off x="0" y="0"/>
+                      <a:ext cx="5940000" cy="2959017"/>
+                    </a:xfrm>
+                    <a:prstGeom prst="rect"/>
+                  </pic:spPr>
+                </pic:pic>
+              </a:graphicData>
+            </a:graphic>
+          </wp:inline>
+        </w:drawing>
       </w:r>
     </w:p>
     <w:p>
@@ -6794,27 +6892,41 @@
     </w:p>
     <w:p>
       <w:pPr>
-        <w:shd w:val="clear" w:color="auto" w:fill="FFF4E5"/>
-        <w:pBdr>
-          <w:top w:val="single" w:sz="12" w:space="6" w:color="E67E22"/>
-          <w:bottom w:val="single" w:sz="12" w:space="6" w:color="E67E22"/>
-          <w:left w:val="single" w:sz="12" w:space="6" w:color="E67E22"/>
-          <w:right w:val="single" w:sz="12" w:space="6" w:color="E67E22"/>
-        </w:pBdr>
+        <w:jc w:val="center"/>
       </w:pPr>
       <w:r>
-        <w:rPr>
-          <w:b/>
-          <w:color w:val="B35C00"/>
-        </w:rPr>
-        <w:t>PRINT PENDENTE: docs/prints/08-staging-pagina-inicial.png</w:t>
-        <w:br/>
-      </w:r>
-      <w:r>
-        <w:rPr>
-          <w:sz w:val="20"/>
-        </w:rPr>
-        <w:t>Artefato evidencias-staging/pagina-inicial.png.</w:t>
+        <w:drawing>
+          <wp:inline xmlns:a="http://schemas.openxmlformats.org/drawingml/2006/main" xmlns:pic="http://schemas.openxmlformats.org/drawingml/2006/picture">
+            <wp:extent cx="5940000" cy="3739678"/>
+            <wp:docPr id="8" name="Picture 8"/>
+            <wp:cNvGraphicFramePr>
+              <a:graphicFrameLocks noChangeAspect="1"/>
+            </wp:cNvGraphicFramePr>
+            <a:graphic>
+              <a:graphicData uri="http://schemas.openxmlformats.org/drawingml/2006/picture">
+                <pic:pic>
+                  <pic:nvPicPr>
+                    <pic:cNvPr id="0" name="08-staging-pagina-inicial.png"/>
+                    <pic:cNvPicPr/>
+                  </pic:nvPicPr>
+                  <pic:blipFill>
+                    <a:blip r:embed="rId17"/>
+                    <a:stretch>
+                      <a:fillRect/>
+                    </a:stretch>
+                  </pic:blipFill>
+                  <pic:spPr>
+                    <a:xfrm>
+                      <a:off x="0" y="0"/>
+                      <a:ext cx="5940000" cy="3739678"/>
+                    </a:xfrm>
+                    <a:prstGeom prst="rect"/>
+                  </pic:spPr>
+                </pic:pic>
+              </a:graphicData>
+            </a:graphic>
+          </wp:inline>
+        </w:drawing>
       </w:r>
     </w:p>
     <w:p>
@@ -6831,27 +6943,41 @@
     </w:p>
     <w:p>
       <w:pPr>
-        <w:shd w:val="clear" w:color="auto" w:fill="FFF4E5"/>
-        <w:pBdr>
-          <w:top w:val="single" w:sz="12" w:space="6" w:color="E67E22"/>
-          <w:bottom w:val="single" w:sz="12" w:space="6" w:color="E67E22"/>
-          <w:left w:val="single" w:sz="12" w:space="6" w:color="E67E22"/>
-          <w:right w:val="single" w:sz="12" w:space="6" w:color="E67E22"/>
-        </w:pBdr>
+        <w:jc w:val="center"/>
       </w:pPr>
       <w:r>
-        <w:rPr>
-          <w:b/>
-          <w:color w:val="B35C00"/>
-        </w:rPr>
-        <w:t>PRINT PENDENTE: docs/prints/10-staging-swagger.png</w:t>
-        <w:br/>
-      </w:r>
-      <w:r>
-        <w:rPr>
-          <w:sz w:val="20"/>
-        </w:rPr>
-        <w:t>Artefato evidencias-staging/swagger-ui.png.</w:t>
+        <w:drawing>
+          <wp:inline xmlns:a="http://schemas.openxmlformats.org/drawingml/2006/main" xmlns:pic="http://schemas.openxmlformats.org/drawingml/2006/picture">
+            <wp:extent cx="5940000" cy="3739678"/>
+            <wp:docPr id="9" name="Picture 9"/>
+            <wp:cNvGraphicFramePr>
+              <a:graphicFrameLocks noChangeAspect="1"/>
+            </wp:cNvGraphicFramePr>
+            <a:graphic>
+              <a:graphicData uri="http://schemas.openxmlformats.org/drawingml/2006/picture">
+                <pic:pic>
+                  <pic:nvPicPr>
+                    <pic:cNvPr id="0" name="10-staging-swagger.png"/>
+                    <pic:cNvPicPr/>
+                  </pic:nvPicPr>
+                  <pic:blipFill>
+                    <a:blip r:embed="rId18"/>
+                    <a:stretch>
+                      <a:fillRect/>
+                    </a:stretch>
+                  </pic:blipFill>
+                  <pic:spPr>
+                    <a:xfrm>
+                      <a:off x="0" y="0"/>
+                      <a:ext cx="5940000" cy="3739678"/>
+                    </a:xfrm>
+                    <a:prstGeom prst="rect"/>
+                  </pic:spPr>
+                </pic:pic>
+              </a:graphicData>
+            </a:graphic>
+          </wp:inline>
+        </w:drawing>
       </w:r>
     </w:p>
     <w:p>
@@ -6868,27 +6994,41 @@
     </w:p>
     <w:p>
       <w:pPr>
-        <w:shd w:val="clear" w:color="auto" w:fill="FFF4E5"/>
-        <w:pBdr>
-          <w:top w:val="single" w:sz="12" w:space="6" w:color="E67E22"/>
-          <w:bottom w:val="single" w:sz="12" w:space="6" w:color="E67E22"/>
-          <w:left w:val="single" w:sz="12" w:space="6" w:color="E67E22"/>
-          <w:right w:val="single" w:sz="12" w:space="6" w:color="E67E22"/>
-        </w:pBdr>
+        <w:jc w:val="center"/>
       </w:pPr>
       <w:r>
-        <w:rPr>
-          <w:b/>
-          <w:color w:val="B35C00"/>
-        </w:rPr>
-        <w:t>PRINT PENDENTE: docs/prints/09-producao-pagina-inicial.png</w:t>
-        <w:br/>
-      </w:r>
-      <w:r>
-        <w:rPr>
-          <w:sz w:val="20"/>
-        </w:rPr>
-        <w:t>Artefato evidencias-production/pagina-inicial.png.</w:t>
+        <w:drawing>
+          <wp:inline xmlns:a="http://schemas.openxmlformats.org/drawingml/2006/main" xmlns:pic="http://schemas.openxmlformats.org/drawingml/2006/picture">
+            <wp:extent cx="5940000" cy="3739678"/>
+            <wp:docPr id="10" name="Picture 10"/>
+            <wp:cNvGraphicFramePr>
+              <a:graphicFrameLocks noChangeAspect="1"/>
+            </wp:cNvGraphicFramePr>
+            <a:graphic>
+              <a:graphicData uri="http://schemas.openxmlformats.org/drawingml/2006/picture">
+                <pic:pic>
+                  <pic:nvPicPr>
+                    <pic:cNvPr id="0" name="09-producao-pagina-inicial.png"/>
+                    <pic:cNvPicPr/>
+                  </pic:nvPicPr>
+                  <pic:blipFill>
+                    <a:blip r:embed="rId19"/>
+                    <a:stretch>
+                      <a:fillRect/>
+                    </a:stretch>
+                  </pic:blipFill>
+                  <pic:spPr>
+                    <a:xfrm>
+                      <a:off x="0" y="0"/>
+                      <a:ext cx="5940000" cy="3739678"/>
+                    </a:xfrm>
+                    <a:prstGeom prst="rect"/>
+                  </pic:spPr>
+                </pic:pic>
+              </a:graphicData>
+            </a:graphic>
+          </wp:inline>
+        </w:drawing>
       </w:r>
     </w:p>
     <w:p>
@@ -6905,27 +7045,41 @@
     </w:p>
     <w:p>
       <w:pPr>
-        <w:shd w:val="clear" w:color="auto" w:fill="FFF4E5"/>
-        <w:pBdr>
-          <w:top w:val="single" w:sz="12" w:space="6" w:color="E67E22"/>
-          <w:bottom w:val="single" w:sz="12" w:space="6" w:color="E67E22"/>
-          <w:left w:val="single" w:sz="12" w:space="6" w:color="E67E22"/>
-          <w:right w:val="single" w:sz="12" w:space="6" w:color="E67E22"/>
-        </w:pBdr>
+        <w:jc w:val="center"/>
       </w:pPr>
       <w:r>
-        <w:rPr>
-          <w:b/>
-          <w:color w:val="B35C00"/>
-        </w:rPr>
-        <w:t>PRINT PENDENTE: docs/prints/11-environments.png</w:t>
-        <w:br/>
-      </w:r>
-      <w:r>
-        <w:rPr>
-          <w:sz w:val="20"/>
-        </w:rPr>
-        <w:t>Página Deployments (ou Settings &gt; Environments) com staging e production implantados.</w:t>
+        <w:drawing>
+          <wp:inline xmlns:a="http://schemas.openxmlformats.org/drawingml/2006/main" xmlns:pic="http://schemas.openxmlformats.org/drawingml/2006/picture">
+            <wp:extent cx="5940000" cy="2668469"/>
+            <wp:docPr id="11" name="Picture 11"/>
+            <wp:cNvGraphicFramePr>
+              <a:graphicFrameLocks noChangeAspect="1"/>
+            </wp:cNvGraphicFramePr>
+            <a:graphic>
+              <a:graphicData uri="http://schemas.openxmlformats.org/drawingml/2006/picture">
+                <pic:pic>
+                  <pic:nvPicPr>
+                    <pic:cNvPr id="0" name="11-environments.png"/>
+                    <pic:cNvPicPr/>
+                  </pic:nvPicPr>
+                  <pic:blipFill>
+                    <a:blip r:embed="rId20"/>
+                    <a:stretch>
+                      <a:fillRect/>
+                    </a:stretch>
+                  </pic:blipFill>
+                  <pic:spPr>
+                    <a:xfrm>
+                      <a:off x="0" y="0"/>
+                      <a:ext cx="5940000" cy="2668469"/>
+                    </a:xfrm>
+                    <a:prstGeom prst="rect"/>
+                  </pic:spPr>
+                </pic:pic>
+              </a:graphicData>
+            </a:graphic>
+          </wp:inline>
+        </w:drawing>
       </w:r>
     </w:p>
     <w:p>
@@ -7532,7 +7686,114 @@
         <w:pStyle w:val="Heading2"/>
       </w:pPr>
       <w:r>
-        <w:t>7.9 Garantir que produção receba exatamente o que foi testado</w:t>
+        <w:t>7.9 Primeira execução chegou à produção sem aprovação</w:t>
+      </w:r>
+    </w:p>
+    <w:p>
+      <w:pPr>
+        <w:jc w:val="both"/>
+      </w:pPr>
+      <w:r>
+        <w:rPr>
+          <w:b/>
+        </w:rPr>
+        <w:t>Problema.</w:t>
+      </w:r>
+      <w:r>
+        <w:t xml:space="preserve"> Os environments </w:t>
+      </w:r>
+      <w:r>
+        <w:rPr>
+          <w:rFonts w:ascii="Consolas" w:hAnsi="Consolas"/>
+          <w:color w:val="1B4D3E"/>
+          <w:sz w:val="19"/>
+        </w:rPr>
+        <w:t>staging</w:t>
+      </w:r>
+      <w:r>
+        <w:t xml:space="preserve"> e </w:t>
+      </w:r>
+      <w:r>
+        <w:rPr>
+          <w:rFonts w:ascii="Consolas" w:hAnsi="Consolas"/>
+          <w:color w:val="1B4D3E"/>
+          <w:sz w:val="19"/>
+        </w:rPr>
+        <w:t>production</w:t>
+      </w:r>
+      <w:r>
+        <w:t xml:space="preserve"> não existiam antes do primeiro push. O GitHub os criou automaticamente, sem regras de proteção, e a execução #1 implantou em produção sem esperar revisão.</w:t>
+      </w:r>
+    </w:p>
+    <w:p>
+      <w:pPr>
+        <w:jc w:val="both"/>
+      </w:pPr>
+      <w:r>
+        <w:rPr>
+          <w:b/>
+        </w:rPr>
+        <w:t>Solução.</w:t>
+      </w:r>
+      <w:r>
+        <w:t xml:space="preserve"> Configuração de </w:t>
+      </w:r>
+      <w:r>
+        <w:rPr>
+          <w:i/>
+        </w:rPr>
+        <w:t>Required reviewers</w:t>
+      </w:r>
+      <w:r>
+        <w:t xml:space="preserve"> no environment </w:t>
+      </w:r>
+      <w:r>
+        <w:rPr>
+          <w:rFonts w:ascii="Consolas" w:hAnsi="Consolas"/>
+          <w:color w:val="1B4D3E"/>
+          <w:sz w:val="19"/>
+        </w:rPr>
+        <w:t>production</w:t>
+      </w:r>
+      <w:r>
+        <w:t xml:space="preserve"> e nova execução manual (</w:t>
+      </w:r>
+      <w:r>
+        <w:rPr>
+          <w:rFonts w:ascii="Consolas" w:hAnsi="Consolas"/>
+          <w:color w:val="1B4D3E"/>
+          <w:sz w:val="19"/>
+        </w:rPr>
+        <w:t>workflow_dispatch</w:t>
+      </w:r>
+      <w:r>
+        <w:t xml:space="preserve">). A partir dela, o pipeline para em </w:t>
+      </w:r>
+      <w:r>
+        <w:rPr>
+          <w:i/>
+        </w:rPr>
+        <w:t>Waiting for review</w:t>
+      </w:r>
+      <w:r>
+        <w:t xml:space="preserve"> antes de produção (Figura 8). Também ficou registrado que o </w:t>
+      </w:r>
+      <w:r>
+        <w:rPr>
+          <w:i/>
+        </w:rPr>
+        <w:t>Re-run</w:t>
+      </w:r>
+      <w:r>
+        <w:t xml:space="preserve"> de uma execução repete o mesmo commit: para implantar um commit novo, é preciso disparar uma nova execução.</w:t>
+      </w:r>
+    </w:p>
+    <w:p>
+      <w:pPr>
+        <w:pStyle w:val="Heading2"/>
+      </w:pPr>
+      <w:r>
+        <w:t>7.10 Garantir que produção receba exatamente o que foi testado</w:t>
       </w:r>
     </w:p>
     <w:p>
@@ -8205,7 +8466,7 @@
               <w:rPr>
                 <w:sz w:val="19"/>
               </w:rPr>
-              <w:t>☐</w:t>
+              <w:t>☑</w:t>
             </w:r>
           </w:p>
         </w:tc>
@@ -8243,7 +8504,7 @@
               <w:rPr>
                 <w:sz w:val="19"/>
               </w:rPr>
-              <w:t>☐</w:t>
+              <w:t>☑</w:t>
             </w:r>
           </w:p>
         </w:tc>
@@ -8281,7 +8542,7 @@
               <w:rPr>
                 <w:sz w:val="19"/>
               </w:rPr>
-              <w:t>☐</w:t>
+              <w:t>☑</w:t>
             </w:r>
           </w:p>
         </w:tc>

</xml_diff>